<commit_message>
Configuracion punto 8 ajuste
</commit_message>
<xml_diff>
--- a/Actividad3/Momento Evaluativo 3.docx
+++ b/Actividad3/Momento Evaluativo 3.docx
@@ -1065,7 +1065,7 @@
           <w:noProof/>
         </w:rPr>
         <w:drawing>
-          <wp:inline distT="0" distB="0" distL="0" distR="0" wp14:anchorId="38949725" wp14:editId="3CDB209E">
+          <wp:inline distT="0" distB="0" distL="0" distR="0" wp14:anchorId="38949725" wp14:editId="5994B8C1">
             <wp:extent cx="2775006" cy="2775006"/>
             <wp:effectExtent l="0" t="0" r="6350" b="6350"/>
             <wp:docPr id="6500078" name="Imagen 6"/>
@@ -4297,7 +4297,7 @@
                 <w:szCs w:val="22"/>
               </w:rPr>
               <w:drawing>
-                <wp:inline distT="0" distB="0" distL="0" distR="0" wp14:anchorId="5E8710BE" wp14:editId="3306BA7C">
+                <wp:inline distT="0" distB="0" distL="0" distR="0" wp14:anchorId="5E8710BE" wp14:editId="6B529115">
                   <wp:extent cx="2647950" cy="2647950"/>
                   <wp:effectExtent l="0" t="0" r="0" b="0"/>
                   <wp:docPr id="831389928" name="Imagen 2"/>
@@ -4808,7 +4808,7 @@
                 <w:szCs w:val="22"/>
               </w:rPr>
               <w:drawing>
-                <wp:inline distT="0" distB="0" distL="0" distR="0" wp14:anchorId="5A27FDBE" wp14:editId="5AEC4B4C">
+                <wp:inline distT="0" distB="0" distL="0" distR="0" wp14:anchorId="5A27FDBE" wp14:editId="2920D330">
                   <wp:extent cx="2743200" cy="2743200"/>
                   <wp:effectExtent l="0" t="0" r="0" b="0"/>
                   <wp:docPr id="501441251" name="Imagen 4"/>
@@ -5180,7 +5180,7 @@
                 <w:szCs w:val="22"/>
               </w:rPr>
               <w:drawing>
-                <wp:inline distT="0" distB="0" distL="0" distR="0" wp14:anchorId="4731AF6F" wp14:editId="63B7B64C">
+                <wp:inline distT="0" distB="0" distL="0" distR="0" wp14:anchorId="4731AF6F" wp14:editId="54CF208E">
                   <wp:extent cx="2528515" cy="2528515"/>
                   <wp:effectExtent l="0" t="0" r="5715" b="5715"/>
                   <wp:docPr id="1883847802" name="Imagen 7"/>
@@ -5351,27 +5351,7 @@
                 <w:sz w:val="22"/>
                 <w:szCs w:val="22"/>
               </w:rPr>
-              <w:t>Después de aplicar el filtro laplaciano de 4 vecinos, la imagen presenta un incremento en la definición de los bordes y detalles finos en comparación con la imagen original. Se observa que elementos como las plumas del ave, la estructura de la Torre Eiffel</w:t>
-            </w:r>
-            <w:r>
-              <w:rPr>
-                <w:rFonts w:ascii="Aptos Light" w:hAnsi="Aptos Light"/>
-                <w:i/>
-                <w:iCs/>
-                <w:sz w:val="22"/>
-                <w:szCs w:val="22"/>
-              </w:rPr>
-              <w:t>, las barandas de los balcones</w:t>
-            </w:r>
-            <w:r>
-              <w:rPr>
-                <w:rFonts w:ascii="Aptos Light" w:hAnsi="Aptos Light"/>
-                <w:i/>
-                <w:iCs/>
-                <w:sz w:val="22"/>
-                <w:szCs w:val="22"/>
-              </w:rPr>
-              <w:t xml:space="preserve"> y los contornos de los edificios adquieren una mayor nitidez, lo que permite distinguir con más claridad las formas y separaciones entre objetos. Asimismo, los reflejos sobre la superficie húmeda muestran líneas más definidas, aportando una ligera mejora en la percepción de profundidad sin alterar significativamente la iluminación general de la escena.</w:t>
+              <w:t>Después de aplicar el filtro laplaciano de 4 vecinos, la imagen presenta un incremento en la definición de los bordes y detalles finos en comparación con la imagen original. Se observa que elementos como las plumas del ave, la estructura de la Torre Eiffel, las barandas de los balcones y los contornos de los edificios adquieren una mayor nitidez, lo que permite distinguir con más claridad las formas y separaciones entre objetos. Asimismo, los reflejos sobre la superficie húmeda muestran líneas más definidas, aportando una ligera mejora en la percepción de profundidad sin alterar significativamente la iluminación general de la escena.</w:t>
             </w:r>
           </w:p>
           <w:p>
@@ -5859,7 +5839,7 @@
                 <w:sz w:val="22"/>
                 <w:szCs w:val="22"/>
               </w:rPr>
-              <w:t>La imagen desbalanceada presenta un desajuste cromático caracterizado por una dominante magenta/violeta, originada principalmente por un déficit significativo en el canal verde. Esto se evidencia al comparar los promedios RGB: en la imagen desbalanceada el canal verde tiene un valor de 0.2585, mientras que en la imagen objetivo es de 0.5666, mientras que los canales rojo y azul se mantienen prácticamente iguales. Este comportamiento provoca que zonas que deberían ser neutras, como la nieve y el cuerpo del pingüino, adquieran una tonalidad rosada no natural, alterando la percepción visual de la escena.</w:t>
+              <w:t>La imagen desbalanceada presenta un desajuste cromático caracterizado por una dominante magenta/violeta, originada principalmente por un déficit significativo en el canal verde. Esto se evidencia al comparar los promedios RGB, donde el canal verde en la imagen desbalanceada tiene un valor de 0.2585, mientras que en la imagen objetivo es de 0.5666, mientras que los canales rojo y azul se mantienen prácticamente iguales. Esta diferencia provoca que elementos que deberían percibirse con tonalidades neutras, como la nieve y el cuerpo del pingüino, adquieran una coloración rosada no natural, afectando la fidelidad visual y la percepción correcta de la escena.</w:t>
             </w:r>
           </w:p>
           <w:p>
@@ -5881,7 +5861,17 @@
                 <w:sz w:val="22"/>
                 <w:szCs w:val="22"/>
               </w:rPr>
-              <w:t>Para corregir este desbalance, se aplicó inicialmente una transformación global de escalamiento por canal RGB utilizando los factores [1.0001, 2.1917, 0.9999], lo que permitió compensar el canal verde y mejorar parcialmente el balance de color (SSIM = 0.8330). Posteriormente, se aplicó una transformación local por bloques que ajusta los valores de color según las variaciones espaciales de la imagen, logrando una mejor aproximación a la referencia. Como resultado, la imagen corregida alcanzó promedios RGB de [0.5215, 0.5666, 0.5819] y un SSIM de 0.9926. No obstante, alcanzar un SSIM de 1.0 resulta difícil mediante transformaciones globales o locales continuas, ya que la imagen objetivo implica variaciones de color dependientes de cada píxel que no pueden representarse completamente mediante una única función de transformación, sino que requerirían una corrección exacta píxel a píxel, lo cual no corresponde a un proceso de transformación sino a una reconstrucción directa de la imagen.</w:t>
+              <w:t>Para corregir este desbalance, se aplicó inicialmente una transformación global de escalamiento por canal RGB utilizando los factores [1.0001, 2.1917, 0.9999], lo que permitió compensar el canal verde y mejorar parcialmente el balance de color, alcanzando un SSIM de 0.8330. Posteriormente, se implementó una transformación vectorial RGB por bloques, en la cual cada píxel fue tratado como un vector de color y ajustado localmente mediante una transformación afín, permitiendo capturar variaciones cromáticas más complejas y lograr una mayor precisión en la corrección. Como resultado, la imagen corregida alcanzó promedios RGB de [0.5215, 0.5666, 0.5819], coincidentes con la imagen objetivo, y un SSIM de 0.9990, lo que demuestra que mediante la integración de técnicas de balance de color y procesamiento vectorial RGB es posible lograr una corrección altamente precisa, validando la efectividad de estos métodos para resolver desbalances cromáticos complejos en imágenes digitales.</w:t>
+            </w:r>
+            <w:r>
+              <w:rPr>
+                <w:rFonts w:ascii="Aptos Light" w:hAnsi="Aptos Light"/>
+                <w:i/>
+                <w:iCs/>
+                <w:sz w:val="22"/>
+                <w:szCs w:val="22"/>
+              </w:rPr>
+              <w:t xml:space="preserve"> </w:t>
             </w:r>
           </w:p>
           <w:p>

</xml_diff>